<commit_message>
Revert "Initial GROQ version"
This reverts commit 2a0a4f941b0515f6b03a17b68d7c472f08f07123.
</commit_message>
<xml_diff>
--- a/test_Report.docx
+++ b/test_Report.docx
@@ -35,7 +35,7 @@
         <w:rPr>
           <w:sz w:val="20"/>
         </w:rPr>
-        <w:t>Generated: 20 June 2026</w:t>
+        <w:t>Generated: 18 June 2026</w:t>
       </w:r>
     </w:p>
     <w:p/>
@@ -82,7 +82,7 @@
           </w:tcPr>
           <w:p>
             <w:r>
-              <w:t>Test Project for DOCX Format Check</w:t>
+              <w:t>AI and Digital Literacy Training for Telecom Employees</w:t>
             </w:r>
           </w:p>
         </w:tc>
@@ -107,7 +107,7 @@
           </w:tcPr>
           <w:p>
             <w:r>
-              <w:t>Test Department, New Delhi — 110001</w:t>
+              <w:t>RailTel Corporation of India Limited, New Delhi — 110001</w:t>
             </w:r>
           </w:p>
         </w:tc>
@@ -157,7 +157,7 @@
           </w:tcPr>
           <w:p>
             <w:r>
-              <w:t>TEST/001</w:t>
+              <w:t>RTC/AI/2025/047</w:t>
             </w:r>
           </w:p>
         </w:tc>
@@ -232,7 +232,7 @@
           </w:tcPr>
           <w:p>
             <w:r>
-              <w:t>Delhi — Central Delhi</w:t>
+              <w:t>Pan-India — Multiple locations</w:t>
             </w:r>
           </w:p>
         </w:tc>
@@ -260,7 +260,7 @@
         <w:rPr>
           <w:sz w:val="22"/>
         </w:rPr>
-        <w:t>This is a test tender to verify the DOCX format is correct.</w:t>
+        <w:t>RailTel Corporation of India Limited is seeking a training partner to conduct a 45-day AI and Digital Literacy program for 500 telecom employees across India. The program covers ChatGPT, Prompt Engineering, and AI productivity tools. Budget is ₹2.5 Crore with a submission deadline of 25 June 2025.</w:t>
       </w:r>
     </w:p>
     <w:p>
@@ -284,7 +284,7 @@
         <w:rPr>
           <w:sz w:val="22"/>
         </w:rPr>
-        <w:t>Point 1 of scope</w:t>
+        <w:t>45-day training program for 500 telecom employees</w:t>
       </w:r>
     </w:p>
     <w:p>
@@ -295,7 +295,7 @@
         <w:rPr>
           <w:sz w:val="22"/>
         </w:rPr>
-        <w:t>Point 2 of scope</w:t>
+        <w:t>Modules: ChatGPT, Prompt Engineering, AI for productivity</w:t>
       </w:r>
     </w:p>
     <w:p>
@@ -306,7 +306,7 @@
         <w:rPr>
           <w:sz w:val="22"/>
         </w:rPr>
-        <w:t>Point 3 of scope</w:t>
+        <w:t>Delivery across RailTel offices pan-India</w:t>
       </w:r>
     </w:p>
     <w:p>
@@ -330,7 +330,7 @@
         <w:rPr>
           <w:sz w:val="22"/>
         </w:rPr>
-        <w:t>Criterion 1</w:t>
+        <w:t>Organisation turnover minimum Rs. 1 Crore</w:t>
       </w:r>
     </w:p>
     <w:p>
@@ -341,7 +341,7 @@
         <w:rPr>
           <w:sz w:val="22"/>
         </w:rPr>
-        <w:t>Criterion 2</w:t>
+        <w:t>NSDC affiliation preferred</w:t>
       </w:r>
     </w:p>
     <w:p>
@@ -352,7 +352,18 @@
         <w:rPr>
           <w:sz w:val="22"/>
         </w:rPr>
-        <w:t>Criterion 3</w:t>
+        <w:t>Minimum 3 years experience in IT or AI training</w:t>
+      </w:r>
+    </w:p>
+    <w:p>
+      <w:pPr>
+        <w:pStyle w:val="ListBullet"/>
+      </w:pPr>
+      <w:r>
+        <w:rPr>
+          <w:sz w:val="22"/>
+        </w:rPr>
+        <w:t>Experience in corporate or PSU training mandatory</w:t>
       </w:r>
     </w:p>
     <w:p>
@@ -501,7 +512,7 @@
           </w:tcPr>
           <w:p>
             <w:r>
-              <w:t>✅ Match</w:t>
+              <w:t>❌ Not applicable</w:t>
             </w:r>
           </w:p>
         </w:tc>
@@ -799,7 +810,7 @@
         <w:rPr>
           <w:sz w:val="22"/>
         </w:rPr>
-        <w:t>Strong match on most criteria.</w:t>
+        <w:t>MeraPath has strong AI training credentials and pan-India delivery capability. NSDC empanelment and past digital literacy projects are key differentiators. Minor gap in telecom-specific PSU references.</w:t>
       </w:r>
     </w:p>
     <w:p>
@@ -823,7 +834,7 @@
         <w:rPr>
           <w:sz w:val="22"/>
         </w:rPr>
-        <w:t>Section 1: Executive Summary</w:t>
+        <w:t>Section 1: Executive Summary and Company Profile</w:t>
       </w:r>
     </w:p>
     <w:p>
@@ -834,7 +845,40 @@
         <w:rPr>
           <w:sz w:val="22"/>
         </w:rPr>
-        <w:t>Section 2: Methodology</w:t>
+        <w:t>Section 2: Understanding of Requirements</w:t>
+      </w:r>
+    </w:p>
+    <w:p>
+      <w:pPr>
+        <w:pStyle w:val="ListBullet"/>
+      </w:pPr>
+      <w:r>
+        <w:rPr>
+          <w:sz w:val="22"/>
+        </w:rPr>
+        <w:t>Section 3: Training Methodology and Curriculum</w:t>
+      </w:r>
+    </w:p>
+    <w:p>
+      <w:pPr>
+        <w:pStyle w:val="ListBullet"/>
+      </w:pPr>
+      <w:r>
+        <w:rPr>
+          <w:sz w:val="22"/>
+        </w:rPr>
+        <w:t>Section 4: Team Profile and Trainer Credentials</w:t>
+      </w:r>
+    </w:p>
+    <w:p>
+      <w:pPr>
+        <w:pStyle w:val="ListBullet"/>
+      </w:pPr>
+      <w:r>
+        <w:rPr>
+          <w:sz w:val="22"/>
+        </w:rPr>
+        <w:t>Section 5: Timeline, Milestones and Budget</w:t>
       </w:r>
     </w:p>
     <w:p>
@@ -858,7 +902,7 @@
         <w:rPr>
           <w:sz w:val="22"/>
         </w:rPr>
-        <w:t>Risk point 1</w:t>
+        <w:t>Tight timeline — 25 June deadline requires immediate action</w:t>
       </w:r>
     </w:p>
     <w:p>
@@ -869,7 +913,7 @@
         <w:rPr>
           <w:sz w:val="22"/>
         </w:rPr>
-        <w:t>Risk point 2</w:t>
+        <w:t>NSDC affiliation is preferred not mandatory — MeraPath qualifies</w:t>
       </w:r>
     </w:p>
     <w:sectPr>

</xml_diff>